<commit_message>
fix: Workbook.docx — tighten vertical spacing per MOOP feedback
Reduced heading + line-table spacing in Family_Captain_Bootcamp_WORKBOOK.docx:
- h1 spacing 360/180 → 180/80 twips (~50% reduction)
- h2 spacing 280/120 → 140/60
- h3 spacing 200/100 → 100/50
- oneLine() row height 460 → 340 twips (writing room from ~0.32" to ~0.24")
- checkbox spacing-after 60 → 30 twips

Result: task pages no longer have a full screen of empty space between Action checklist, What I noticed, What I'll do differently sections.
</commit_message>
<xml_diff>
--- a/downloads/family-captain/Family_Captain_Bootcamp_WORKBOOK.docx
+++ b/downloads/family-captain/Family_Captain_Bootcamp_WORKBOOK.docx
@@ -351,7 +351,7 @@
     </w:p>
     <w:p>
       <w:pPr>
-        <w:spacing w:after="60"/>
+        <w:spacing w:after="30"/>
         <w:ind w:left="360"/>
       </w:pPr>
       <w:r>
@@ -360,7 +360,7 @@
     </w:p>
     <w:p>
       <w:pPr>
-        <w:spacing w:after="60"/>
+        <w:spacing w:after="30"/>
         <w:ind w:left="360"/>
       </w:pPr>
       <w:r>
@@ -369,7 +369,7 @@
     </w:p>
     <w:p>
       <w:pPr>
-        <w:spacing w:after="60"/>
+        <w:spacing w:after="30"/>
         <w:ind w:left="360"/>
       </w:pPr>
       <w:r>
@@ -378,7 +378,7 @@
     </w:p>
     <w:p>
       <w:pPr>
-        <w:spacing w:after="60"/>
+        <w:spacing w:after="30"/>
         <w:ind w:left="360"/>
       </w:pPr>
       <w:r>
@@ -415,7 +415,7 @@
       </w:tblGrid>
       <w:tr>
         <w:trPr>
-          <w:trHeight w:val="460" w:hRule="exact"/>
+          <w:trHeight w:val="340" w:hRule="exact"/>
         </w:trPr>
         <w:tc>
           <w:tcPr>
@@ -466,7 +466,7 @@
       </w:tblGrid>
       <w:tr>
         <w:trPr>
-          <w:trHeight w:val="460" w:hRule="exact"/>
+          <w:trHeight w:val="340" w:hRule="exact"/>
         </w:trPr>
         <w:tc>
           <w:tcPr>
@@ -517,7 +517,7 @@
       </w:tblGrid>
       <w:tr>
         <w:trPr>
-          <w:trHeight w:val="460" w:hRule="exact"/>
+          <w:trHeight w:val="340" w:hRule="exact"/>
         </w:trPr>
         <w:tc>
           <w:tcPr>
@@ -568,7 +568,7 @@
       </w:tblGrid>
       <w:tr>
         <w:trPr>
-          <w:trHeight w:val="460" w:hRule="exact"/>
+          <w:trHeight w:val="340" w:hRule="exact"/>
         </w:trPr>
         <w:tc>
           <w:tcPr>
@@ -619,7 +619,7 @@
       </w:tblGrid>
       <w:tr>
         <w:trPr>
-          <w:trHeight w:val="460" w:hRule="exact"/>
+          <w:trHeight w:val="340" w:hRule="exact"/>
         </w:trPr>
         <w:tc>
           <w:tcPr>
@@ -675,7 +675,7 @@
       </w:tblGrid>
       <w:tr>
         <w:trPr>
-          <w:trHeight w:val="460" w:hRule="exact"/>
+          <w:trHeight w:val="340" w:hRule="exact"/>
         </w:trPr>
         <w:tc>
           <w:tcPr>
@@ -726,7 +726,7 @@
       </w:tblGrid>
       <w:tr>
         <w:trPr>
-          <w:trHeight w:val="460" w:hRule="exact"/>
+          <w:trHeight w:val="340" w:hRule="exact"/>
         </w:trPr>
         <w:tc>
           <w:tcPr>
@@ -777,7 +777,7 @@
       </w:tblGrid>
       <w:tr>
         <w:trPr>
-          <w:trHeight w:val="460" w:hRule="exact"/>
+          <w:trHeight w:val="340" w:hRule="exact"/>
         </w:trPr>
         <w:tc>
           <w:tcPr>
@@ -912,7 +912,7 @@
     </w:p>
     <w:p>
       <w:pPr>
-        <w:spacing w:after="60"/>
+        <w:spacing w:after="30"/>
         <w:ind w:left="360"/>
       </w:pPr>
       <w:r>
@@ -921,7 +921,7 @@
     </w:p>
     <w:p>
       <w:pPr>
-        <w:spacing w:after="60"/>
+        <w:spacing w:after="30"/>
         <w:ind w:left="360"/>
       </w:pPr>
       <w:r>
@@ -930,7 +930,7 @@
     </w:p>
     <w:p>
       <w:pPr>
-        <w:spacing w:after="60"/>
+        <w:spacing w:after="30"/>
         <w:ind w:left="360"/>
       </w:pPr>
       <w:r>
@@ -967,7 +967,7 @@
       </w:tblGrid>
       <w:tr>
         <w:trPr>
-          <w:trHeight w:val="460" w:hRule="exact"/>
+          <w:trHeight w:val="340" w:hRule="exact"/>
         </w:trPr>
         <w:tc>
           <w:tcPr>
@@ -1018,7 +1018,7 @@
       </w:tblGrid>
       <w:tr>
         <w:trPr>
-          <w:trHeight w:val="460" w:hRule="exact"/>
+          <w:trHeight w:val="340" w:hRule="exact"/>
         </w:trPr>
         <w:tc>
           <w:tcPr>
@@ -1069,7 +1069,7 @@
       </w:tblGrid>
       <w:tr>
         <w:trPr>
-          <w:trHeight w:val="460" w:hRule="exact"/>
+          <w:trHeight w:val="340" w:hRule="exact"/>
         </w:trPr>
         <w:tc>
           <w:tcPr>
@@ -1120,7 +1120,7 @@
       </w:tblGrid>
       <w:tr>
         <w:trPr>
-          <w:trHeight w:val="460" w:hRule="exact"/>
+          <w:trHeight w:val="340" w:hRule="exact"/>
         </w:trPr>
         <w:tc>
           <w:tcPr>
@@ -1171,7 +1171,7 @@
       </w:tblGrid>
       <w:tr>
         <w:trPr>
-          <w:trHeight w:val="460" w:hRule="exact"/>
+          <w:trHeight w:val="340" w:hRule="exact"/>
         </w:trPr>
         <w:tc>
           <w:tcPr>
@@ -1227,7 +1227,7 @@
       </w:tblGrid>
       <w:tr>
         <w:trPr>
-          <w:trHeight w:val="460" w:hRule="exact"/>
+          <w:trHeight w:val="340" w:hRule="exact"/>
         </w:trPr>
         <w:tc>
           <w:tcPr>
@@ -1278,7 +1278,7 @@
       </w:tblGrid>
       <w:tr>
         <w:trPr>
-          <w:trHeight w:val="460" w:hRule="exact"/>
+          <w:trHeight w:val="340" w:hRule="exact"/>
         </w:trPr>
         <w:tc>
           <w:tcPr>
@@ -1329,7 +1329,7 @@
       </w:tblGrid>
       <w:tr>
         <w:trPr>
-          <w:trHeight w:val="460" w:hRule="exact"/>
+          <w:trHeight w:val="340" w:hRule="exact"/>
         </w:trPr>
         <w:tc>
           <w:tcPr>
@@ -1464,7 +1464,7 @@
     </w:p>
     <w:p>
       <w:pPr>
-        <w:spacing w:after="60"/>
+        <w:spacing w:after="30"/>
         <w:ind w:left="360"/>
       </w:pPr>
       <w:r>
@@ -1473,7 +1473,7 @@
     </w:p>
     <w:p>
       <w:pPr>
-        <w:spacing w:after="60"/>
+        <w:spacing w:after="30"/>
         <w:ind w:left="360"/>
       </w:pPr>
       <w:r>
@@ -1482,7 +1482,7 @@
     </w:p>
     <w:p>
       <w:pPr>
-        <w:spacing w:after="60"/>
+        <w:spacing w:after="30"/>
         <w:ind w:left="360"/>
       </w:pPr>
       <w:r>
@@ -1491,7 +1491,7 @@
     </w:p>
     <w:p>
       <w:pPr>
-        <w:spacing w:after="60"/>
+        <w:spacing w:after="30"/>
         <w:ind w:left="360"/>
       </w:pPr>
       <w:r>
@@ -1500,7 +1500,7 @@
     </w:p>
     <w:p>
       <w:pPr>
-        <w:spacing w:after="60"/>
+        <w:spacing w:after="30"/>
         <w:ind w:left="360"/>
       </w:pPr>
       <w:r>
@@ -1537,7 +1537,7 @@
       </w:tblGrid>
       <w:tr>
         <w:trPr>
-          <w:trHeight w:val="460" w:hRule="exact"/>
+          <w:trHeight w:val="340" w:hRule="exact"/>
         </w:trPr>
         <w:tc>
           <w:tcPr>
@@ -1588,7 +1588,7 @@
       </w:tblGrid>
       <w:tr>
         <w:trPr>
-          <w:trHeight w:val="460" w:hRule="exact"/>
+          <w:trHeight w:val="340" w:hRule="exact"/>
         </w:trPr>
         <w:tc>
           <w:tcPr>
@@ -1639,7 +1639,7 @@
       </w:tblGrid>
       <w:tr>
         <w:trPr>
-          <w:trHeight w:val="460" w:hRule="exact"/>
+          <w:trHeight w:val="340" w:hRule="exact"/>
         </w:trPr>
         <w:tc>
           <w:tcPr>
@@ -1690,7 +1690,7 @@
       </w:tblGrid>
       <w:tr>
         <w:trPr>
-          <w:trHeight w:val="460" w:hRule="exact"/>
+          <w:trHeight w:val="340" w:hRule="exact"/>
         </w:trPr>
         <w:tc>
           <w:tcPr>
@@ -1741,7 +1741,7 @@
       </w:tblGrid>
       <w:tr>
         <w:trPr>
-          <w:trHeight w:val="460" w:hRule="exact"/>
+          <w:trHeight w:val="340" w:hRule="exact"/>
         </w:trPr>
         <w:tc>
           <w:tcPr>
@@ -1797,7 +1797,7 @@
       </w:tblGrid>
       <w:tr>
         <w:trPr>
-          <w:trHeight w:val="460" w:hRule="exact"/>
+          <w:trHeight w:val="340" w:hRule="exact"/>
         </w:trPr>
         <w:tc>
           <w:tcPr>
@@ -1848,7 +1848,7 @@
       </w:tblGrid>
       <w:tr>
         <w:trPr>
-          <w:trHeight w:val="460" w:hRule="exact"/>
+          <w:trHeight w:val="340" w:hRule="exact"/>
         </w:trPr>
         <w:tc>
           <w:tcPr>
@@ -1899,7 +1899,7 @@
       </w:tblGrid>
       <w:tr>
         <w:trPr>
-          <w:trHeight w:val="460" w:hRule="exact"/>
+          <w:trHeight w:val="340" w:hRule="exact"/>
         </w:trPr>
         <w:tc>
           <w:tcPr>
@@ -2092,7 +2092,7 @@
       </w:tblGrid>
       <w:tr>
         <w:trPr>
-          <w:trHeight w:val="460" w:hRule="exact"/>
+          <w:trHeight w:val="340" w:hRule="exact"/>
         </w:trPr>
         <w:tc>
           <w:tcPr>
@@ -2143,7 +2143,7 @@
       </w:tblGrid>
       <w:tr>
         <w:trPr>
-          <w:trHeight w:val="460" w:hRule="exact"/>
+          <w:trHeight w:val="340" w:hRule="exact"/>
         </w:trPr>
         <w:tc>
           <w:tcPr>
@@ -2194,7 +2194,7 @@
       </w:tblGrid>
       <w:tr>
         <w:trPr>
-          <w:trHeight w:val="460" w:hRule="exact"/>
+          <w:trHeight w:val="340" w:hRule="exact"/>
         </w:trPr>
         <w:tc>
           <w:tcPr>
@@ -2245,7 +2245,7 @@
       </w:tblGrid>
       <w:tr>
         <w:trPr>
-          <w:trHeight w:val="460" w:hRule="exact"/>
+          <w:trHeight w:val="340" w:hRule="exact"/>
         </w:trPr>
         <w:tc>
           <w:tcPr>
@@ -2296,7 +2296,7 @@
       </w:tblGrid>
       <w:tr>
         <w:trPr>
-          <w:trHeight w:val="460" w:hRule="exact"/>
+          <w:trHeight w:val="340" w:hRule="exact"/>
         </w:trPr>
         <w:tc>
           <w:tcPr>
@@ -2347,7 +2347,7 @@
       </w:tblGrid>
       <w:tr>
         <w:trPr>
-          <w:trHeight w:val="460" w:hRule="exact"/>
+          <w:trHeight w:val="340" w:hRule="exact"/>
         </w:trPr>
         <w:tc>
           <w:tcPr>
@@ -2398,7 +2398,7 @@
       </w:tblGrid>
       <w:tr>
         <w:trPr>
-          <w:trHeight w:val="460" w:hRule="exact"/>
+          <w:trHeight w:val="340" w:hRule="exact"/>
         </w:trPr>
         <w:tc>
           <w:tcPr>
@@ -2449,7 +2449,7 @@
       </w:tblGrid>
       <w:tr>
         <w:trPr>
-          <w:trHeight w:val="460" w:hRule="exact"/>
+          <w:trHeight w:val="340" w:hRule="exact"/>
         </w:trPr>
         <w:tc>
           <w:tcPr>
@@ -2500,7 +2500,7 @@
       </w:tblGrid>
       <w:tr>
         <w:trPr>
-          <w:trHeight w:val="460" w:hRule="exact"/>
+          <w:trHeight w:val="340" w:hRule="exact"/>
         </w:trPr>
         <w:tc>
           <w:tcPr>
@@ -2551,7 +2551,7 @@
       </w:tblGrid>
       <w:tr>
         <w:trPr>
-          <w:trHeight w:val="460" w:hRule="exact"/>
+          <w:trHeight w:val="340" w:hRule="exact"/>
         </w:trPr>
         <w:tc>
           <w:tcPr>
@@ -2782,7 +2782,7 @@
     </w:p>
     <w:p>
       <w:pPr>
-        <w:spacing w:after="60"/>
+        <w:spacing w:after="30"/>
         <w:ind w:left="360"/>
       </w:pPr>
       <w:r>
@@ -2791,7 +2791,7 @@
     </w:p>
     <w:p>
       <w:pPr>
-        <w:spacing w:after="60"/>
+        <w:spacing w:after="30"/>
         <w:ind w:left="360"/>
       </w:pPr>
       <w:r>
@@ -2800,7 +2800,7 @@
     </w:p>
     <w:p>
       <w:pPr>
-        <w:spacing w:after="60"/>
+        <w:spacing w:after="30"/>
         <w:ind w:left="360"/>
       </w:pPr>
       <w:r>
@@ -2809,7 +2809,7 @@
     </w:p>
     <w:p>
       <w:pPr>
-        <w:spacing w:after="60"/>
+        <w:spacing w:after="30"/>
         <w:ind w:left="360"/>
       </w:pPr>
       <w:r>
@@ -2846,7 +2846,7 @@
       </w:tblGrid>
       <w:tr>
         <w:trPr>
-          <w:trHeight w:val="460" w:hRule="exact"/>
+          <w:trHeight w:val="340" w:hRule="exact"/>
         </w:trPr>
         <w:tc>
           <w:tcPr>
@@ -2897,7 +2897,7 @@
       </w:tblGrid>
       <w:tr>
         <w:trPr>
-          <w:trHeight w:val="460" w:hRule="exact"/>
+          <w:trHeight w:val="340" w:hRule="exact"/>
         </w:trPr>
         <w:tc>
           <w:tcPr>
@@ -2948,7 +2948,7 @@
       </w:tblGrid>
       <w:tr>
         <w:trPr>
-          <w:trHeight w:val="460" w:hRule="exact"/>
+          <w:trHeight w:val="340" w:hRule="exact"/>
         </w:trPr>
         <w:tc>
           <w:tcPr>
@@ -2999,7 +2999,7 @@
       </w:tblGrid>
       <w:tr>
         <w:trPr>
-          <w:trHeight w:val="460" w:hRule="exact"/>
+          <w:trHeight w:val="340" w:hRule="exact"/>
         </w:trPr>
         <w:tc>
           <w:tcPr>
@@ -3050,7 +3050,7 @@
       </w:tblGrid>
       <w:tr>
         <w:trPr>
-          <w:trHeight w:val="460" w:hRule="exact"/>
+          <w:trHeight w:val="340" w:hRule="exact"/>
         </w:trPr>
         <w:tc>
           <w:tcPr>
@@ -3106,7 +3106,7 @@
       </w:tblGrid>
       <w:tr>
         <w:trPr>
-          <w:trHeight w:val="460" w:hRule="exact"/>
+          <w:trHeight w:val="340" w:hRule="exact"/>
         </w:trPr>
         <w:tc>
           <w:tcPr>
@@ -3157,7 +3157,7 @@
       </w:tblGrid>
       <w:tr>
         <w:trPr>
-          <w:trHeight w:val="460" w:hRule="exact"/>
+          <w:trHeight w:val="340" w:hRule="exact"/>
         </w:trPr>
         <w:tc>
           <w:tcPr>
@@ -3208,7 +3208,7 @@
       </w:tblGrid>
       <w:tr>
         <w:trPr>
-          <w:trHeight w:val="460" w:hRule="exact"/>
+          <w:trHeight w:val="340" w:hRule="exact"/>
         </w:trPr>
         <w:tc>
           <w:tcPr>
@@ -3343,7 +3343,7 @@
     </w:p>
     <w:p>
       <w:pPr>
-        <w:spacing w:after="60"/>
+        <w:spacing w:after="30"/>
         <w:ind w:left="360"/>
       </w:pPr>
       <w:r>
@@ -3352,7 +3352,7 @@
     </w:p>
     <w:p>
       <w:pPr>
-        <w:spacing w:after="60"/>
+        <w:spacing w:after="30"/>
         <w:ind w:left="360"/>
       </w:pPr>
       <w:r>
@@ -3361,7 +3361,7 @@
     </w:p>
     <w:p>
       <w:pPr>
-        <w:spacing w:after="60"/>
+        <w:spacing w:after="30"/>
         <w:ind w:left="360"/>
       </w:pPr>
       <w:r>
@@ -3370,7 +3370,7 @@
     </w:p>
     <w:p>
       <w:pPr>
-        <w:spacing w:after="60"/>
+        <w:spacing w:after="30"/>
         <w:ind w:left="360"/>
       </w:pPr>
       <w:r>
@@ -3407,7 +3407,7 @@
       </w:tblGrid>
       <w:tr>
         <w:trPr>
-          <w:trHeight w:val="460" w:hRule="exact"/>
+          <w:trHeight w:val="340" w:hRule="exact"/>
         </w:trPr>
         <w:tc>
           <w:tcPr>
@@ -3458,7 +3458,7 @@
       </w:tblGrid>
       <w:tr>
         <w:trPr>
-          <w:trHeight w:val="460" w:hRule="exact"/>
+          <w:trHeight w:val="340" w:hRule="exact"/>
         </w:trPr>
         <w:tc>
           <w:tcPr>
@@ -3509,7 +3509,7 @@
       </w:tblGrid>
       <w:tr>
         <w:trPr>
-          <w:trHeight w:val="460" w:hRule="exact"/>
+          <w:trHeight w:val="340" w:hRule="exact"/>
         </w:trPr>
         <w:tc>
           <w:tcPr>
@@ -3560,7 +3560,7 @@
       </w:tblGrid>
       <w:tr>
         <w:trPr>
-          <w:trHeight w:val="460" w:hRule="exact"/>
+          <w:trHeight w:val="340" w:hRule="exact"/>
         </w:trPr>
         <w:tc>
           <w:tcPr>
@@ -3611,7 +3611,7 @@
       </w:tblGrid>
       <w:tr>
         <w:trPr>
-          <w:trHeight w:val="460" w:hRule="exact"/>
+          <w:trHeight w:val="340" w:hRule="exact"/>
         </w:trPr>
         <w:tc>
           <w:tcPr>
@@ -3667,7 +3667,7 @@
       </w:tblGrid>
       <w:tr>
         <w:trPr>
-          <w:trHeight w:val="460" w:hRule="exact"/>
+          <w:trHeight w:val="340" w:hRule="exact"/>
         </w:trPr>
         <w:tc>
           <w:tcPr>
@@ -3718,7 +3718,7 @@
       </w:tblGrid>
       <w:tr>
         <w:trPr>
-          <w:trHeight w:val="460" w:hRule="exact"/>
+          <w:trHeight w:val="340" w:hRule="exact"/>
         </w:trPr>
         <w:tc>
           <w:tcPr>
@@ -3769,7 +3769,7 @@
       </w:tblGrid>
       <w:tr>
         <w:trPr>
-          <w:trHeight w:val="460" w:hRule="exact"/>
+          <w:trHeight w:val="340" w:hRule="exact"/>
         </w:trPr>
         <w:tc>
           <w:tcPr>
@@ -3904,7 +3904,7 @@
     </w:p>
     <w:p>
       <w:pPr>
-        <w:spacing w:after="60"/>
+        <w:spacing w:after="30"/>
         <w:ind w:left="360"/>
       </w:pPr>
       <w:r>
@@ -3913,7 +3913,7 @@
     </w:p>
     <w:p>
       <w:pPr>
-        <w:spacing w:after="60"/>
+        <w:spacing w:after="30"/>
         <w:ind w:left="360"/>
       </w:pPr>
       <w:r>
@@ -3922,7 +3922,7 @@
     </w:p>
     <w:p>
       <w:pPr>
-        <w:spacing w:after="60"/>
+        <w:spacing w:after="30"/>
         <w:ind w:left="360"/>
       </w:pPr>
       <w:r>
@@ -3931,7 +3931,7 @@
     </w:p>
     <w:p>
       <w:pPr>
-        <w:spacing w:after="60"/>
+        <w:spacing w:after="30"/>
         <w:ind w:left="360"/>
       </w:pPr>
       <w:r>
@@ -3968,7 +3968,7 @@
       </w:tblGrid>
       <w:tr>
         <w:trPr>
-          <w:trHeight w:val="460" w:hRule="exact"/>
+          <w:trHeight w:val="340" w:hRule="exact"/>
         </w:trPr>
         <w:tc>
           <w:tcPr>
@@ -4019,7 +4019,7 @@
       </w:tblGrid>
       <w:tr>
         <w:trPr>
-          <w:trHeight w:val="460" w:hRule="exact"/>
+          <w:trHeight w:val="340" w:hRule="exact"/>
         </w:trPr>
         <w:tc>
           <w:tcPr>
@@ -4070,7 +4070,7 @@
       </w:tblGrid>
       <w:tr>
         <w:trPr>
-          <w:trHeight w:val="460" w:hRule="exact"/>
+          <w:trHeight w:val="340" w:hRule="exact"/>
         </w:trPr>
         <w:tc>
           <w:tcPr>
@@ -4121,7 +4121,7 @@
       </w:tblGrid>
       <w:tr>
         <w:trPr>
-          <w:trHeight w:val="460" w:hRule="exact"/>
+          <w:trHeight w:val="340" w:hRule="exact"/>
         </w:trPr>
         <w:tc>
           <w:tcPr>
@@ -4172,7 +4172,7 @@
       </w:tblGrid>
       <w:tr>
         <w:trPr>
-          <w:trHeight w:val="460" w:hRule="exact"/>
+          <w:trHeight w:val="340" w:hRule="exact"/>
         </w:trPr>
         <w:tc>
           <w:tcPr>
@@ -4228,7 +4228,7 @@
       </w:tblGrid>
       <w:tr>
         <w:trPr>
-          <w:trHeight w:val="460" w:hRule="exact"/>
+          <w:trHeight w:val="340" w:hRule="exact"/>
         </w:trPr>
         <w:tc>
           <w:tcPr>
@@ -4279,7 +4279,7 @@
       </w:tblGrid>
       <w:tr>
         <w:trPr>
-          <w:trHeight w:val="460" w:hRule="exact"/>
+          <w:trHeight w:val="340" w:hRule="exact"/>
         </w:trPr>
         <w:tc>
           <w:tcPr>
@@ -4330,7 +4330,7 @@
       </w:tblGrid>
       <w:tr>
         <w:trPr>
-          <w:trHeight w:val="460" w:hRule="exact"/>
+          <w:trHeight w:val="340" w:hRule="exact"/>
         </w:trPr>
         <w:tc>
           <w:tcPr>
@@ -4523,7 +4523,7 @@
       </w:tblGrid>
       <w:tr>
         <w:trPr>
-          <w:trHeight w:val="460" w:hRule="exact"/>
+          <w:trHeight w:val="340" w:hRule="exact"/>
         </w:trPr>
         <w:tc>
           <w:tcPr>
@@ -4574,7 +4574,7 @@
       </w:tblGrid>
       <w:tr>
         <w:trPr>
-          <w:trHeight w:val="460" w:hRule="exact"/>
+          <w:trHeight w:val="340" w:hRule="exact"/>
         </w:trPr>
         <w:tc>
           <w:tcPr>
@@ -4625,7 +4625,7 @@
       </w:tblGrid>
       <w:tr>
         <w:trPr>
-          <w:trHeight w:val="460" w:hRule="exact"/>
+          <w:trHeight w:val="340" w:hRule="exact"/>
         </w:trPr>
         <w:tc>
           <w:tcPr>
@@ -4676,7 +4676,7 @@
       </w:tblGrid>
       <w:tr>
         <w:trPr>
-          <w:trHeight w:val="460" w:hRule="exact"/>
+          <w:trHeight w:val="340" w:hRule="exact"/>
         </w:trPr>
         <w:tc>
           <w:tcPr>
@@ -4727,7 +4727,7 @@
       </w:tblGrid>
       <w:tr>
         <w:trPr>
-          <w:trHeight w:val="460" w:hRule="exact"/>
+          <w:trHeight w:val="340" w:hRule="exact"/>
         </w:trPr>
         <w:tc>
           <w:tcPr>
@@ -4778,7 +4778,7 @@
       </w:tblGrid>
       <w:tr>
         <w:trPr>
-          <w:trHeight w:val="460" w:hRule="exact"/>
+          <w:trHeight w:val="340" w:hRule="exact"/>
         </w:trPr>
         <w:tc>
           <w:tcPr>
@@ -4829,7 +4829,7 @@
       </w:tblGrid>
       <w:tr>
         <w:trPr>
-          <w:trHeight w:val="460" w:hRule="exact"/>
+          <w:trHeight w:val="340" w:hRule="exact"/>
         </w:trPr>
         <w:tc>
           <w:tcPr>
@@ -4880,7 +4880,7 @@
       </w:tblGrid>
       <w:tr>
         <w:trPr>
-          <w:trHeight w:val="460" w:hRule="exact"/>
+          <w:trHeight w:val="340" w:hRule="exact"/>
         </w:trPr>
         <w:tc>
           <w:tcPr>
@@ -4931,7 +4931,7 @@
       </w:tblGrid>
       <w:tr>
         <w:trPr>
-          <w:trHeight w:val="460" w:hRule="exact"/>
+          <w:trHeight w:val="340" w:hRule="exact"/>
         </w:trPr>
         <w:tc>
           <w:tcPr>
@@ -4982,7 +4982,7 @@
       </w:tblGrid>
       <w:tr>
         <w:trPr>
-          <w:trHeight w:val="460" w:hRule="exact"/>
+          <w:trHeight w:val="340" w:hRule="exact"/>
         </w:trPr>
         <w:tc>
           <w:tcPr>
@@ -5213,7 +5213,7 @@
     </w:p>
     <w:p>
       <w:pPr>
-        <w:spacing w:after="60"/>
+        <w:spacing w:after="30"/>
         <w:ind w:left="360"/>
       </w:pPr>
       <w:r>
@@ -5222,7 +5222,7 @@
     </w:p>
     <w:p>
       <w:pPr>
-        <w:spacing w:after="60"/>
+        <w:spacing w:after="30"/>
         <w:ind w:left="360"/>
       </w:pPr>
       <w:r>
@@ -5231,7 +5231,7 @@
     </w:p>
     <w:p>
       <w:pPr>
-        <w:spacing w:after="60"/>
+        <w:spacing w:after="30"/>
         <w:ind w:left="360"/>
       </w:pPr>
       <w:r>
@@ -5240,7 +5240,7 @@
     </w:p>
     <w:p>
       <w:pPr>
-        <w:spacing w:after="60"/>
+        <w:spacing w:after="30"/>
         <w:ind w:left="360"/>
       </w:pPr>
       <w:r>
@@ -5277,7 +5277,7 @@
       </w:tblGrid>
       <w:tr>
         <w:trPr>
-          <w:trHeight w:val="460" w:hRule="exact"/>
+          <w:trHeight w:val="340" w:hRule="exact"/>
         </w:trPr>
         <w:tc>
           <w:tcPr>
@@ -5328,7 +5328,7 @@
       </w:tblGrid>
       <w:tr>
         <w:trPr>
-          <w:trHeight w:val="460" w:hRule="exact"/>
+          <w:trHeight w:val="340" w:hRule="exact"/>
         </w:trPr>
         <w:tc>
           <w:tcPr>
@@ -5379,7 +5379,7 @@
       </w:tblGrid>
       <w:tr>
         <w:trPr>
-          <w:trHeight w:val="460" w:hRule="exact"/>
+          <w:trHeight w:val="340" w:hRule="exact"/>
         </w:trPr>
         <w:tc>
           <w:tcPr>
@@ -5430,7 +5430,7 @@
       </w:tblGrid>
       <w:tr>
         <w:trPr>
-          <w:trHeight w:val="460" w:hRule="exact"/>
+          <w:trHeight w:val="340" w:hRule="exact"/>
         </w:trPr>
         <w:tc>
           <w:tcPr>
@@ -5481,7 +5481,7 @@
       </w:tblGrid>
       <w:tr>
         <w:trPr>
-          <w:trHeight w:val="460" w:hRule="exact"/>
+          <w:trHeight w:val="340" w:hRule="exact"/>
         </w:trPr>
         <w:tc>
           <w:tcPr>
@@ -5537,7 +5537,7 @@
       </w:tblGrid>
       <w:tr>
         <w:trPr>
-          <w:trHeight w:val="460" w:hRule="exact"/>
+          <w:trHeight w:val="340" w:hRule="exact"/>
         </w:trPr>
         <w:tc>
           <w:tcPr>
@@ -5588,7 +5588,7 @@
       </w:tblGrid>
       <w:tr>
         <w:trPr>
-          <w:trHeight w:val="460" w:hRule="exact"/>
+          <w:trHeight w:val="340" w:hRule="exact"/>
         </w:trPr>
         <w:tc>
           <w:tcPr>
@@ -5639,7 +5639,7 @@
       </w:tblGrid>
       <w:tr>
         <w:trPr>
-          <w:trHeight w:val="460" w:hRule="exact"/>
+          <w:trHeight w:val="340" w:hRule="exact"/>
         </w:trPr>
         <w:tc>
           <w:tcPr>
@@ -5774,7 +5774,7 @@
     </w:p>
     <w:p>
       <w:pPr>
-        <w:spacing w:after="60"/>
+        <w:spacing w:after="30"/>
         <w:ind w:left="360"/>
       </w:pPr>
       <w:r>
@@ -5783,7 +5783,7 @@
     </w:p>
     <w:p>
       <w:pPr>
-        <w:spacing w:after="60"/>
+        <w:spacing w:after="30"/>
         <w:ind w:left="360"/>
       </w:pPr>
       <w:r>
@@ -5792,7 +5792,7 @@
     </w:p>
     <w:p>
       <w:pPr>
-        <w:spacing w:after="60"/>
+        <w:spacing w:after="30"/>
         <w:ind w:left="360"/>
       </w:pPr>
       <w:r>
@@ -5801,7 +5801,7 @@
     </w:p>
     <w:p>
       <w:pPr>
-        <w:spacing w:after="60"/>
+        <w:spacing w:after="30"/>
         <w:ind w:left="360"/>
       </w:pPr>
       <w:r>
@@ -5838,7 +5838,7 @@
       </w:tblGrid>
       <w:tr>
         <w:trPr>
-          <w:trHeight w:val="460" w:hRule="exact"/>
+          <w:trHeight w:val="340" w:hRule="exact"/>
         </w:trPr>
         <w:tc>
           <w:tcPr>
@@ -5889,7 +5889,7 @@
       </w:tblGrid>
       <w:tr>
         <w:trPr>
-          <w:trHeight w:val="460" w:hRule="exact"/>
+          <w:trHeight w:val="340" w:hRule="exact"/>
         </w:trPr>
         <w:tc>
           <w:tcPr>
@@ -5940,7 +5940,7 @@
       </w:tblGrid>
       <w:tr>
         <w:trPr>
-          <w:trHeight w:val="460" w:hRule="exact"/>
+          <w:trHeight w:val="340" w:hRule="exact"/>
         </w:trPr>
         <w:tc>
           <w:tcPr>
@@ -5991,7 +5991,7 @@
       </w:tblGrid>
       <w:tr>
         <w:trPr>
-          <w:trHeight w:val="460" w:hRule="exact"/>
+          <w:trHeight w:val="340" w:hRule="exact"/>
         </w:trPr>
         <w:tc>
           <w:tcPr>
@@ -6042,7 +6042,7 @@
       </w:tblGrid>
       <w:tr>
         <w:trPr>
-          <w:trHeight w:val="460" w:hRule="exact"/>
+          <w:trHeight w:val="340" w:hRule="exact"/>
         </w:trPr>
         <w:tc>
           <w:tcPr>
@@ -6098,7 +6098,7 @@
       </w:tblGrid>
       <w:tr>
         <w:trPr>
-          <w:trHeight w:val="460" w:hRule="exact"/>
+          <w:trHeight w:val="340" w:hRule="exact"/>
         </w:trPr>
         <w:tc>
           <w:tcPr>
@@ -6149,7 +6149,7 @@
       </w:tblGrid>
       <w:tr>
         <w:trPr>
-          <w:trHeight w:val="460" w:hRule="exact"/>
+          <w:trHeight w:val="340" w:hRule="exact"/>
         </w:trPr>
         <w:tc>
           <w:tcPr>
@@ -6200,7 +6200,7 @@
       </w:tblGrid>
       <w:tr>
         <w:trPr>
-          <w:trHeight w:val="460" w:hRule="exact"/>
+          <w:trHeight w:val="340" w:hRule="exact"/>
         </w:trPr>
         <w:tc>
           <w:tcPr>
@@ -6335,7 +6335,7 @@
     </w:p>
     <w:p>
       <w:pPr>
-        <w:spacing w:after="60"/>
+        <w:spacing w:after="30"/>
         <w:ind w:left="360"/>
       </w:pPr>
       <w:r>
@@ -6344,7 +6344,7 @@
     </w:p>
     <w:p>
       <w:pPr>
-        <w:spacing w:after="60"/>
+        <w:spacing w:after="30"/>
         <w:ind w:left="360"/>
       </w:pPr>
       <w:r>
@@ -6353,7 +6353,7 @@
     </w:p>
     <w:p>
       <w:pPr>
-        <w:spacing w:after="60"/>
+        <w:spacing w:after="30"/>
         <w:ind w:left="360"/>
       </w:pPr>
       <w:r>
@@ -6362,7 +6362,7 @@
     </w:p>
     <w:p>
       <w:pPr>
-        <w:spacing w:after="60"/>
+        <w:spacing w:after="30"/>
         <w:ind w:left="360"/>
       </w:pPr>
       <w:r>
@@ -6399,7 +6399,7 @@
       </w:tblGrid>
       <w:tr>
         <w:trPr>
-          <w:trHeight w:val="460" w:hRule="exact"/>
+          <w:trHeight w:val="340" w:hRule="exact"/>
         </w:trPr>
         <w:tc>
           <w:tcPr>
@@ -6450,7 +6450,7 @@
       </w:tblGrid>
       <w:tr>
         <w:trPr>
-          <w:trHeight w:val="460" w:hRule="exact"/>
+          <w:trHeight w:val="340" w:hRule="exact"/>
         </w:trPr>
         <w:tc>
           <w:tcPr>
@@ -6501,7 +6501,7 @@
       </w:tblGrid>
       <w:tr>
         <w:trPr>
-          <w:trHeight w:val="460" w:hRule="exact"/>
+          <w:trHeight w:val="340" w:hRule="exact"/>
         </w:trPr>
         <w:tc>
           <w:tcPr>
@@ -6552,7 +6552,7 @@
       </w:tblGrid>
       <w:tr>
         <w:trPr>
-          <w:trHeight w:val="460" w:hRule="exact"/>
+          <w:trHeight w:val="340" w:hRule="exact"/>
         </w:trPr>
         <w:tc>
           <w:tcPr>
@@ -6603,7 +6603,7 @@
       </w:tblGrid>
       <w:tr>
         <w:trPr>
-          <w:trHeight w:val="460" w:hRule="exact"/>
+          <w:trHeight w:val="340" w:hRule="exact"/>
         </w:trPr>
         <w:tc>
           <w:tcPr>
@@ -6659,7 +6659,7 @@
       </w:tblGrid>
       <w:tr>
         <w:trPr>
-          <w:trHeight w:val="460" w:hRule="exact"/>
+          <w:trHeight w:val="340" w:hRule="exact"/>
         </w:trPr>
         <w:tc>
           <w:tcPr>
@@ -6710,7 +6710,7 @@
       </w:tblGrid>
       <w:tr>
         <w:trPr>
-          <w:trHeight w:val="460" w:hRule="exact"/>
+          <w:trHeight w:val="340" w:hRule="exact"/>
         </w:trPr>
         <w:tc>
           <w:tcPr>
@@ -6761,7 +6761,7 @@
       </w:tblGrid>
       <w:tr>
         <w:trPr>
-          <w:trHeight w:val="460" w:hRule="exact"/>
+          <w:trHeight w:val="340" w:hRule="exact"/>
         </w:trPr>
         <w:tc>
           <w:tcPr>
@@ -6954,7 +6954,7 @@
       </w:tblGrid>
       <w:tr>
         <w:trPr>
-          <w:trHeight w:val="460" w:hRule="exact"/>
+          <w:trHeight w:val="340" w:hRule="exact"/>
         </w:trPr>
         <w:tc>
           <w:tcPr>
@@ -7005,7 +7005,7 @@
       </w:tblGrid>
       <w:tr>
         <w:trPr>
-          <w:trHeight w:val="460" w:hRule="exact"/>
+          <w:trHeight w:val="340" w:hRule="exact"/>
         </w:trPr>
         <w:tc>
           <w:tcPr>
@@ -7056,7 +7056,7 @@
       </w:tblGrid>
       <w:tr>
         <w:trPr>
-          <w:trHeight w:val="460" w:hRule="exact"/>
+          <w:trHeight w:val="340" w:hRule="exact"/>
         </w:trPr>
         <w:tc>
           <w:tcPr>
@@ -7107,7 +7107,7 @@
       </w:tblGrid>
       <w:tr>
         <w:trPr>
-          <w:trHeight w:val="460" w:hRule="exact"/>
+          <w:trHeight w:val="340" w:hRule="exact"/>
         </w:trPr>
         <w:tc>
           <w:tcPr>
@@ -7158,7 +7158,7 @@
       </w:tblGrid>
       <w:tr>
         <w:trPr>
-          <w:trHeight w:val="460" w:hRule="exact"/>
+          <w:trHeight w:val="340" w:hRule="exact"/>
         </w:trPr>
         <w:tc>
           <w:tcPr>
@@ -7209,7 +7209,7 @@
       </w:tblGrid>
       <w:tr>
         <w:trPr>
-          <w:trHeight w:val="460" w:hRule="exact"/>
+          <w:trHeight w:val="340" w:hRule="exact"/>
         </w:trPr>
         <w:tc>
           <w:tcPr>
@@ -7260,7 +7260,7 @@
       </w:tblGrid>
       <w:tr>
         <w:trPr>
-          <w:trHeight w:val="460" w:hRule="exact"/>
+          <w:trHeight w:val="340" w:hRule="exact"/>
         </w:trPr>
         <w:tc>
           <w:tcPr>
@@ -7311,7 +7311,7 @@
       </w:tblGrid>
       <w:tr>
         <w:trPr>
-          <w:trHeight w:val="460" w:hRule="exact"/>
+          <w:trHeight w:val="340" w:hRule="exact"/>
         </w:trPr>
         <w:tc>
           <w:tcPr>
@@ -7362,7 +7362,7 @@
       </w:tblGrid>
       <w:tr>
         <w:trPr>
-          <w:trHeight w:val="460" w:hRule="exact"/>
+          <w:trHeight w:val="340" w:hRule="exact"/>
         </w:trPr>
         <w:tc>
           <w:tcPr>
@@ -7413,7 +7413,7 @@
       </w:tblGrid>
       <w:tr>
         <w:trPr>
-          <w:trHeight w:val="460" w:hRule="exact"/>
+          <w:trHeight w:val="340" w:hRule="exact"/>
         </w:trPr>
         <w:tc>
           <w:tcPr>
@@ -7644,7 +7644,7 @@
     </w:p>
     <w:p>
       <w:pPr>
-        <w:spacing w:after="60"/>
+        <w:spacing w:after="30"/>
         <w:ind w:left="360"/>
       </w:pPr>
       <w:r>
@@ -7653,7 +7653,7 @@
     </w:p>
     <w:p>
       <w:pPr>
-        <w:spacing w:after="60"/>
+        <w:spacing w:after="30"/>
         <w:ind w:left="360"/>
       </w:pPr>
       <w:r>
@@ -7662,7 +7662,7 @@
     </w:p>
     <w:p>
       <w:pPr>
-        <w:spacing w:after="60"/>
+        <w:spacing w:after="30"/>
         <w:ind w:left="360"/>
       </w:pPr>
       <w:r>
@@ -7671,7 +7671,7 @@
     </w:p>
     <w:p>
       <w:pPr>
-        <w:spacing w:after="60"/>
+        <w:spacing w:after="30"/>
         <w:ind w:left="360"/>
       </w:pPr>
       <w:r>
@@ -7708,7 +7708,7 @@
       </w:tblGrid>
       <w:tr>
         <w:trPr>
-          <w:trHeight w:val="460" w:hRule="exact"/>
+          <w:trHeight w:val="340" w:hRule="exact"/>
         </w:trPr>
         <w:tc>
           <w:tcPr>
@@ -7759,7 +7759,7 @@
       </w:tblGrid>
       <w:tr>
         <w:trPr>
-          <w:trHeight w:val="460" w:hRule="exact"/>
+          <w:trHeight w:val="340" w:hRule="exact"/>
         </w:trPr>
         <w:tc>
           <w:tcPr>
@@ -7810,7 +7810,7 @@
       </w:tblGrid>
       <w:tr>
         <w:trPr>
-          <w:trHeight w:val="460" w:hRule="exact"/>
+          <w:trHeight w:val="340" w:hRule="exact"/>
         </w:trPr>
         <w:tc>
           <w:tcPr>
@@ -7861,7 +7861,7 @@
       </w:tblGrid>
       <w:tr>
         <w:trPr>
-          <w:trHeight w:val="460" w:hRule="exact"/>
+          <w:trHeight w:val="340" w:hRule="exact"/>
         </w:trPr>
         <w:tc>
           <w:tcPr>
@@ -7912,7 +7912,7 @@
       </w:tblGrid>
       <w:tr>
         <w:trPr>
-          <w:trHeight w:val="460" w:hRule="exact"/>
+          <w:trHeight w:val="340" w:hRule="exact"/>
         </w:trPr>
         <w:tc>
           <w:tcPr>
@@ -7968,7 +7968,7 @@
       </w:tblGrid>
       <w:tr>
         <w:trPr>
-          <w:trHeight w:val="460" w:hRule="exact"/>
+          <w:trHeight w:val="340" w:hRule="exact"/>
         </w:trPr>
         <w:tc>
           <w:tcPr>
@@ -8019,7 +8019,7 @@
       </w:tblGrid>
       <w:tr>
         <w:trPr>
-          <w:trHeight w:val="460" w:hRule="exact"/>
+          <w:trHeight w:val="340" w:hRule="exact"/>
         </w:trPr>
         <w:tc>
           <w:tcPr>
@@ -8070,7 +8070,7 @@
       </w:tblGrid>
       <w:tr>
         <w:trPr>
-          <w:trHeight w:val="460" w:hRule="exact"/>
+          <w:trHeight w:val="340" w:hRule="exact"/>
         </w:trPr>
         <w:tc>
           <w:tcPr>
@@ -8205,7 +8205,7 @@
     </w:p>
     <w:p>
       <w:pPr>
-        <w:spacing w:after="60"/>
+        <w:spacing w:after="30"/>
         <w:ind w:left="360"/>
       </w:pPr>
       <w:r>
@@ -8214,7 +8214,7 @@
     </w:p>
     <w:p>
       <w:pPr>
-        <w:spacing w:after="60"/>
+        <w:spacing w:after="30"/>
         <w:ind w:left="360"/>
       </w:pPr>
       <w:r>
@@ -8223,7 +8223,7 @@
     </w:p>
     <w:p>
       <w:pPr>
-        <w:spacing w:after="60"/>
+        <w:spacing w:after="30"/>
         <w:ind w:left="360"/>
       </w:pPr>
       <w:r>
@@ -8232,7 +8232,7 @@
     </w:p>
     <w:p>
       <w:pPr>
-        <w:spacing w:after="60"/>
+        <w:spacing w:after="30"/>
         <w:ind w:left="360"/>
       </w:pPr>
       <w:r>
@@ -8269,7 +8269,7 @@
       </w:tblGrid>
       <w:tr>
         <w:trPr>
-          <w:trHeight w:val="460" w:hRule="exact"/>
+          <w:trHeight w:val="340" w:hRule="exact"/>
         </w:trPr>
         <w:tc>
           <w:tcPr>
@@ -8320,7 +8320,7 @@
       </w:tblGrid>
       <w:tr>
         <w:trPr>
-          <w:trHeight w:val="460" w:hRule="exact"/>
+          <w:trHeight w:val="340" w:hRule="exact"/>
         </w:trPr>
         <w:tc>
           <w:tcPr>
@@ -8371,7 +8371,7 @@
       </w:tblGrid>
       <w:tr>
         <w:trPr>
-          <w:trHeight w:val="460" w:hRule="exact"/>
+          <w:trHeight w:val="340" w:hRule="exact"/>
         </w:trPr>
         <w:tc>
           <w:tcPr>
@@ -8422,7 +8422,7 @@
       </w:tblGrid>
       <w:tr>
         <w:trPr>
-          <w:trHeight w:val="460" w:hRule="exact"/>
+          <w:trHeight w:val="340" w:hRule="exact"/>
         </w:trPr>
         <w:tc>
           <w:tcPr>
@@ -8473,7 +8473,7 @@
       </w:tblGrid>
       <w:tr>
         <w:trPr>
-          <w:trHeight w:val="460" w:hRule="exact"/>
+          <w:trHeight w:val="340" w:hRule="exact"/>
         </w:trPr>
         <w:tc>
           <w:tcPr>
@@ -8529,7 +8529,7 @@
       </w:tblGrid>
       <w:tr>
         <w:trPr>
-          <w:trHeight w:val="460" w:hRule="exact"/>
+          <w:trHeight w:val="340" w:hRule="exact"/>
         </w:trPr>
         <w:tc>
           <w:tcPr>
@@ -8580,7 +8580,7 @@
       </w:tblGrid>
       <w:tr>
         <w:trPr>
-          <w:trHeight w:val="460" w:hRule="exact"/>
+          <w:trHeight w:val="340" w:hRule="exact"/>
         </w:trPr>
         <w:tc>
           <w:tcPr>
@@ -8631,7 +8631,7 @@
       </w:tblGrid>
       <w:tr>
         <w:trPr>
-          <w:trHeight w:val="460" w:hRule="exact"/>
+          <w:trHeight w:val="340" w:hRule="exact"/>
         </w:trPr>
         <w:tc>
           <w:tcPr>
@@ -8766,7 +8766,7 @@
     </w:p>
     <w:p>
       <w:pPr>
-        <w:spacing w:after="60"/>
+        <w:spacing w:after="30"/>
         <w:ind w:left="360"/>
       </w:pPr>
       <w:r>
@@ -8775,7 +8775,7 @@
     </w:p>
     <w:p>
       <w:pPr>
-        <w:spacing w:after="60"/>
+        <w:spacing w:after="30"/>
         <w:ind w:left="360"/>
       </w:pPr>
       <w:r>
@@ -8784,7 +8784,7 @@
     </w:p>
     <w:p>
       <w:pPr>
-        <w:spacing w:after="60"/>
+        <w:spacing w:after="30"/>
         <w:ind w:left="360"/>
       </w:pPr>
       <w:r>
@@ -8793,7 +8793,7 @@
     </w:p>
     <w:p>
       <w:pPr>
-        <w:spacing w:after="60"/>
+        <w:spacing w:after="30"/>
         <w:ind w:left="360"/>
       </w:pPr>
       <w:r>
@@ -8830,7 +8830,7 @@
       </w:tblGrid>
       <w:tr>
         <w:trPr>
-          <w:trHeight w:val="460" w:hRule="exact"/>
+          <w:trHeight w:val="340" w:hRule="exact"/>
         </w:trPr>
         <w:tc>
           <w:tcPr>
@@ -8881,7 +8881,7 @@
       </w:tblGrid>
       <w:tr>
         <w:trPr>
-          <w:trHeight w:val="460" w:hRule="exact"/>
+          <w:trHeight w:val="340" w:hRule="exact"/>
         </w:trPr>
         <w:tc>
           <w:tcPr>
@@ -8932,7 +8932,7 @@
       </w:tblGrid>
       <w:tr>
         <w:trPr>
-          <w:trHeight w:val="460" w:hRule="exact"/>
+          <w:trHeight w:val="340" w:hRule="exact"/>
         </w:trPr>
         <w:tc>
           <w:tcPr>
@@ -8983,7 +8983,7 @@
       </w:tblGrid>
       <w:tr>
         <w:trPr>
-          <w:trHeight w:val="460" w:hRule="exact"/>
+          <w:trHeight w:val="340" w:hRule="exact"/>
         </w:trPr>
         <w:tc>
           <w:tcPr>
@@ -9034,7 +9034,7 @@
       </w:tblGrid>
       <w:tr>
         <w:trPr>
-          <w:trHeight w:val="460" w:hRule="exact"/>
+          <w:trHeight w:val="340" w:hRule="exact"/>
         </w:trPr>
         <w:tc>
           <w:tcPr>
@@ -9090,7 +9090,7 @@
       </w:tblGrid>
       <w:tr>
         <w:trPr>
-          <w:trHeight w:val="460" w:hRule="exact"/>
+          <w:trHeight w:val="340" w:hRule="exact"/>
         </w:trPr>
         <w:tc>
           <w:tcPr>
@@ -9141,7 +9141,7 @@
       </w:tblGrid>
       <w:tr>
         <w:trPr>
-          <w:trHeight w:val="460" w:hRule="exact"/>
+          <w:trHeight w:val="340" w:hRule="exact"/>
         </w:trPr>
         <w:tc>
           <w:tcPr>
@@ -9192,7 +9192,7 @@
       </w:tblGrid>
       <w:tr>
         <w:trPr>
-          <w:trHeight w:val="460" w:hRule="exact"/>
+          <w:trHeight w:val="340" w:hRule="exact"/>
         </w:trPr>
         <w:tc>
           <w:tcPr>
@@ -9385,7 +9385,7 @@
       </w:tblGrid>
       <w:tr>
         <w:trPr>
-          <w:trHeight w:val="460" w:hRule="exact"/>
+          <w:trHeight w:val="340" w:hRule="exact"/>
         </w:trPr>
         <w:tc>
           <w:tcPr>
@@ -9436,7 +9436,7 @@
       </w:tblGrid>
       <w:tr>
         <w:trPr>
-          <w:trHeight w:val="460" w:hRule="exact"/>
+          <w:trHeight w:val="340" w:hRule="exact"/>
         </w:trPr>
         <w:tc>
           <w:tcPr>
@@ -9487,7 +9487,7 @@
       </w:tblGrid>
       <w:tr>
         <w:trPr>
-          <w:trHeight w:val="460" w:hRule="exact"/>
+          <w:trHeight w:val="340" w:hRule="exact"/>
         </w:trPr>
         <w:tc>
           <w:tcPr>
@@ -9538,7 +9538,7 @@
       </w:tblGrid>
       <w:tr>
         <w:trPr>
-          <w:trHeight w:val="460" w:hRule="exact"/>
+          <w:trHeight w:val="340" w:hRule="exact"/>
         </w:trPr>
         <w:tc>
           <w:tcPr>
@@ -9589,7 +9589,7 @@
       </w:tblGrid>
       <w:tr>
         <w:trPr>
-          <w:trHeight w:val="460" w:hRule="exact"/>
+          <w:trHeight w:val="340" w:hRule="exact"/>
         </w:trPr>
         <w:tc>
           <w:tcPr>
@@ -9640,7 +9640,7 @@
       </w:tblGrid>
       <w:tr>
         <w:trPr>
-          <w:trHeight w:val="460" w:hRule="exact"/>
+          <w:trHeight w:val="340" w:hRule="exact"/>
         </w:trPr>
         <w:tc>
           <w:tcPr>
@@ -9691,7 +9691,7 @@
       </w:tblGrid>
       <w:tr>
         <w:trPr>
-          <w:trHeight w:val="460" w:hRule="exact"/>
+          <w:trHeight w:val="340" w:hRule="exact"/>
         </w:trPr>
         <w:tc>
           <w:tcPr>
@@ -9742,7 +9742,7 @@
       </w:tblGrid>
       <w:tr>
         <w:trPr>
-          <w:trHeight w:val="460" w:hRule="exact"/>
+          <w:trHeight w:val="340" w:hRule="exact"/>
         </w:trPr>
         <w:tc>
           <w:tcPr>
@@ -9793,7 +9793,7 @@
       </w:tblGrid>
       <w:tr>
         <w:trPr>
-          <w:trHeight w:val="460" w:hRule="exact"/>
+          <w:trHeight w:val="340" w:hRule="exact"/>
         </w:trPr>
         <w:tc>
           <w:tcPr>
@@ -9844,7 +9844,7 @@
       </w:tblGrid>
       <w:tr>
         <w:trPr>
-          <w:trHeight w:val="460" w:hRule="exact"/>
+          <w:trHeight w:val="340" w:hRule="exact"/>
         </w:trPr>
         <w:tc>
           <w:tcPr>
@@ -10075,7 +10075,7 @@
     </w:p>
     <w:p>
       <w:pPr>
-        <w:spacing w:after="60"/>
+        <w:spacing w:after="30"/>
         <w:ind w:left="360"/>
       </w:pPr>
       <w:r>
@@ -10084,7 +10084,7 @@
     </w:p>
     <w:p>
       <w:pPr>
-        <w:spacing w:after="60"/>
+        <w:spacing w:after="30"/>
         <w:ind w:left="360"/>
       </w:pPr>
       <w:r>
@@ -10093,7 +10093,7 @@
     </w:p>
     <w:p>
       <w:pPr>
-        <w:spacing w:after="60"/>
+        <w:spacing w:after="30"/>
         <w:ind w:left="360"/>
       </w:pPr>
       <w:r>
@@ -10102,7 +10102,7 @@
     </w:p>
     <w:p>
       <w:pPr>
-        <w:spacing w:after="60"/>
+        <w:spacing w:after="30"/>
         <w:ind w:left="360"/>
       </w:pPr>
       <w:r>
@@ -10139,7 +10139,7 @@
       </w:tblGrid>
       <w:tr>
         <w:trPr>
-          <w:trHeight w:val="460" w:hRule="exact"/>
+          <w:trHeight w:val="340" w:hRule="exact"/>
         </w:trPr>
         <w:tc>
           <w:tcPr>
@@ -10190,7 +10190,7 @@
       </w:tblGrid>
       <w:tr>
         <w:trPr>
-          <w:trHeight w:val="460" w:hRule="exact"/>
+          <w:trHeight w:val="340" w:hRule="exact"/>
         </w:trPr>
         <w:tc>
           <w:tcPr>
@@ -10241,7 +10241,7 @@
       </w:tblGrid>
       <w:tr>
         <w:trPr>
-          <w:trHeight w:val="460" w:hRule="exact"/>
+          <w:trHeight w:val="340" w:hRule="exact"/>
         </w:trPr>
         <w:tc>
           <w:tcPr>
@@ -10292,7 +10292,7 @@
       </w:tblGrid>
       <w:tr>
         <w:trPr>
-          <w:trHeight w:val="460" w:hRule="exact"/>
+          <w:trHeight w:val="340" w:hRule="exact"/>
         </w:trPr>
         <w:tc>
           <w:tcPr>
@@ -10343,7 +10343,7 @@
       </w:tblGrid>
       <w:tr>
         <w:trPr>
-          <w:trHeight w:val="460" w:hRule="exact"/>
+          <w:trHeight w:val="340" w:hRule="exact"/>
         </w:trPr>
         <w:tc>
           <w:tcPr>
@@ -10399,7 +10399,7 @@
       </w:tblGrid>
       <w:tr>
         <w:trPr>
-          <w:trHeight w:val="460" w:hRule="exact"/>
+          <w:trHeight w:val="340" w:hRule="exact"/>
         </w:trPr>
         <w:tc>
           <w:tcPr>
@@ -10450,7 +10450,7 @@
       </w:tblGrid>
       <w:tr>
         <w:trPr>
-          <w:trHeight w:val="460" w:hRule="exact"/>
+          <w:trHeight w:val="340" w:hRule="exact"/>
         </w:trPr>
         <w:tc>
           <w:tcPr>
@@ -10501,7 +10501,7 @@
       </w:tblGrid>
       <w:tr>
         <w:trPr>
-          <w:trHeight w:val="460" w:hRule="exact"/>
+          <w:trHeight w:val="340" w:hRule="exact"/>
         </w:trPr>
         <w:tc>
           <w:tcPr>
@@ -10636,7 +10636,7 @@
     </w:p>
     <w:p>
       <w:pPr>
-        <w:spacing w:after="60"/>
+        <w:spacing w:after="30"/>
         <w:ind w:left="360"/>
       </w:pPr>
       <w:r>
@@ -10645,7 +10645,7 @@
     </w:p>
     <w:p>
       <w:pPr>
-        <w:spacing w:after="60"/>
+        <w:spacing w:after="30"/>
         <w:ind w:left="360"/>
       </w:pPr>
       <w:r>
@@ -10654,7 +10654,7 @@
     </w:p>
     <w:p>
       <w:pPr>
-        <w:spacing w:after="60"/>
+        <w:spacing w:after="30"/>
         <w:ind w:left="360"/>
       </w:pPr>
       <w:r>
@@ -10663,7 +10663,7 @@
     </w:p>
     <w:p>
       <w:pPr>
-        <w:spacing w:after="60"/>
+        <w:spacing w:after="30"/>
         <w:ind w:left="360"/>
       </w:pPr>
       <w:r>
@@ -10700,7 +10700,7 @@
       </w:tblGrid>
       <w:tr>
         <w:trPr>
-          <w:trHeight w:val="460" w:hRule="exact"/>
+          <w:trHeight w:val="340" w:hRule="exact"/>
         </w:trPr>
         <w:tc>
           <w:tcPr>
@@ -10751,7 +10751,7 @@
       </w:tblGrid>
       <w:tr>
         <w:trPr>
-          <w:trHeight w:val="460" w:hRule="exact"/>
+          <w:trHeight w:val="340" w:hRule="exact"/>
         </w:trPr>
         <w:tc>
           <w:tcPr>
@@ -10802,7 +10802,7 @@
       </w:tblGrid>
       <w:tr>
         <w:trPr>
-          <w:trHeight w:val="460" w:hRule="exact"/>
+          <w:trHeight w:val="340" w:hRule="exact"/>
         </w:trPr>
         <w:tc>
           <w:tcPr>
@@ -10853,7 +10853,7 @@
       </w:tblGrid>
       <w:tr>
         <w:trPr>
-          <w:trHeight w:val="460" w:hRule="exact"/>
+          <w:trHeight w:val="340" w:hRule="exact"/>
         </w:trPr>
         <w:tc>
           <w:tcPr>
@@ -10904,7 +10904,7 @@
       </w:tblGrid>
       <w:tr>
         <w:trPr>
-          <w:trHeight w:val="460" w:hRule="exact"/>
+          <w:trHeight w:val="340" w:hRule="exact"/>
         </w:trPr>
         <w:tc>
           <w:tcPr>
@@ -10960,7 +10960,7 @@
       </w:tblGrid>
       <w:tr>
         <w:trPr>
-          <w:trHeight w:val="460" w:hRule="exact"/>
+          <w:trHeight w:val="340" w:hRule="exact"/>
         </w:trPr>
         <w:tc>
           <w:tcPr>
@@ -11011,7 +11011,7 @@
       </w:tblGrid>
       <w:tr>
         <w:trPr>
-          <w:trHeight w:val="460" w:hRule="exact"/>
+          <w:trHeight w:val="340" w:hRule="exact"/>
         </w:trPr>
         <w:tc>
           <w:tcPr>
@@ -11062,7 +11062,7 @@
       </w:tblGrid>
       <w:tr>
         <w:trPr>
-          <w:trHeight w:val="460" w:hRule="exact"/>
+          <w:trHeight w:val="340" w:hRule="exact"/>
         </w:trPr>
         <w:tc>
           <w:tcPr>
@@ -11197,7 +11197,7 @@
     </w:p>
     <w:p>
       <w:pPr>
-        <w:spacing w:after="60"/>
+        <w:spacing w:after="30"/>
         <w:ind w:left="360"/>
       </w:pPr>
       <w:r>
@@ -11206,7 +11206,7 @@
     </w:p>
     <w:p>
       <w:pPr>
-        <w:spacing w:after="60"/>
+        <w:spacing w:after="30"/>
         <w:ind w:left="360"/>
       </w:pPr>
       <w:r>
@@ -11215,7 +11215,7 @@
     </w:p>
     <w:p>
       <w:pPr>
-        <w:spacing w:after="60"/>
+        <w:spacing w:after="30"/>
         <w:ind w:left="360"/>
       </w:pPr>
       <w:r>
@@ -11224,7 +11224,7 @@
     </w:p>
     <w:p>
       <w:pPr>
-        <w:spacing w:after="60"/>
+        <w:spacing w:after="30"/>
         <w:ind w:left="360"/>
       </w:pPr>
       <w:r>
@@ -11261,7 +11261,7 @@
       </w:tblGrid>
       <w:tr>
         <w:trPr>
-          <w:trHeight w:val="460" w:hRule="exact"/>
+          <w:trHeight w:val="340" w:hRule="exact"/>
         </w:trPr>
         <w:tc>
           <w:tcPr>
@@ -11312,7 +11312,7 @@
       </w:tblGrid>
       <w:tr>
         <w:trPr>
-          <w:trHeight w:val="460" w:hRule="exact"/>
+          <w:trHeight w:val="340" w:hRule="exact"/>
         </w:trPr>
         <w:tc>
           <w:tcPr>
@@ -11363,7 +11363,7 @@
       </w:tblGrid>
       <w:tr>
         <w:trPr>
-          <w:trHeight w:val="460" w:hRule="exact"/>
+          <w:trHeight w:val="340" w:hRule="exact"/>
         </w:trPr>
         <w:tc>
           <w:tcPr>
@@ -11414,7 +11414,7 @@
       </w:tblGrid>
       <w:tr>
         <w:trPr>
-          <w:trHeight w:val="460" w:hRule="exact"/>
+          <w:trHeight w:val="340" w:hRule="exact"/>
         </w:trPr>
         <w:tc>
           <w:tcPr>
@@ -11465,7 +11465,7 @@
       </w:tblGrid>
       <w:tr>
         <w:trPr>
-          <w:trHeight w:val="460" w:hRule="exact"/>
+          <w:trHeight w:val="340" w:hRule="exact"/>
         </w:trPr>
         <w:tc>
           <w:tcPr>
@@ -11521,7 +11521,7 @@
       </w:tblGrid>
       <w:tr>
         <w:trPr>
-          <w:trHeight w:val="460" w:hRule="exact"/>
+          <w:trHeight w:val="340" w:hRule="exact"/>
         </w:trPr>
         <w:tc>
           <w:tcPr>
@@ -11572,7 +11572,7 @@
       </w:tblGrid>
       <w:tr>
         <w:trPr>
-          <w:trHeight w:val="460" w:hRule="exact"/>
+          <w:trHeight w:val="340" w:hRule="exact"/>
         </w:trPr>
         <w:tc>
           <w:tcPr>
@@ -11623,7 +11623,7 @@
       </w:tblGrid>
       <w:tr>
         <w:trPr>
-          <w:trHeight w:val="460" w:hRule="exact"/>
+          <w:trHeight w:val="340" w:hRule="exact"/>
         </w:trPr>
         <w:tc>
           <w:tcPr>
@@ -11816,7 +11816,7 @@
       </w:tblGrid>
       <w:tr>
         <w:trPr>
-          <w:trHeight w:val="460" w:hRule="exact"/>
+          <w:trHeight w:val="340" w:hRule="exact"/>
         </w:trPr>
         <w:tc>
           <w:tcPr>
@@ -11867,7 +11867,7 @@
       </w:tblGrid>
       <w:tr>
         <w:trPr>
-          <w:trHeight w:val="460" w:hRule="exact"/>
+          <w:trHeight w:val="340" w:hRule="exact"/>
         </w:trPr>
         <w:tc>
           <w:tcPr>
@@ -11918,7 +11918,7 @@
       </w:tblGrid>
       <w:tr>
         <w:trPr>
-          <w:trHeight w:val="460" w:hRule="exact"/>
+          <w:trHeight w:val="340" w:hRule="exact"/>
         </w:trPr>
         <w:tc>
           <w:tcPr>
@@ -11969,7 +11969,7 @@
       </w:tblGrid>
       <w:tr>
         <w:trPr>
-          <w:trHeight w:val="460" w:hRule="exact"/>
+          <w:trHeight w:val="340" w:hRule="exact"/>
         </w:trPr>
         <w:tc>
           <w:tcPr>
@@ -12020,7 +12020,7 @@
       </w:tblGrid>
       <w:tr>
         <w:trPr>
-          <w:trHeight w:val="460" w:hRule="exact"/>
+          <w:trHeight w:val="340" w:hRule="exact"/>
         </w:trPr>
         <w:tc>
           <w:tcPr>
@@ -12071,7 +12071,7 @@
       </w:tblGrid>
       <w:tr>
         <w:trPr>
-          <w:trHeight w:val="460" w:hRule="exact"/>
+          <w:trHeight w:val="340" w:hRule="exact"/>
         </w:trPr>
         <w:tc>
           <w:tcPr>
@@ -12122,7 +12122,7 @@
       </w:tblGrid>
       <w:tr>
         <w:trPr>
-          <w:trHeight w:val="460" w:hRule="exact"/>
+          <w:trHeight w:val="340" w:hRule="exact"/>
         </w:trPr>
         <w:tc>
           <w:tcPr>
@@ -12173,7 +12173,7 @@
       </w:tblGrid>
       <w:tr>
         <w:trPr>
-          <w:trHeight w:val="460" w:hRule="exact"/>
+          <w:trHeight w:val="340" w:hRule="exact"/>
         </w:trPr>
         <w:tc>
           <w:tcPr>
@@ -12224,7 +12224,7 @@
       </w:tblGrid>
       <w:tr>
         <w:trPr>
-          <w:trHeight w:val="460" w:hRule="exact"/>
+          <w:trHeight w:val="340" w:hRule="exact"/>
         </w:trPr>
         <w:tc>
           <w:tcPr>
@@ -12275,7 +12275,7 @@
       </w:tblGrid>
       <w:tr>
         <w:trPr>
-          <w:trHeight w:val="460" w:hRule="exact"/>
+          <w:trHeight w:val="340" w:hRule="exact"/>
         </w:trPr>
         <w:tc>
           <w:tcPr>
@@ -13455,7 +13455,7 @@
       </w:tblGrid>
       <w:tr>
         <w:trPr>
-          <w:trHeight w:val="460" w:hRule="exact"/>
+          <w:trHeight w:val="340" w:hRule="exact"/>
         </w:trPr>
         <w:tc>
           <w:tcPr>
@@ -13506,7 +13506,7 @@
       </w:tblGrid>
       <w:tr>
         <w:trPr>
-          <w:trHeight w:val="460" w:hRule="exact"/>
+          <w:trHeight w:val="340" w:hRule="exact"/>
         </w:trPr>
         <w:tc>
           <w:tcPr>
@@ -13557,7 +13557,7 @@
       </w:tblGrid>
       <w:tr>
         <w:trPr>
-          <w:trHeight w:val="460" w:hRule="exact"/>
+          <w:trHeight w:val="340" w:hRule="exact"/>
         </w:trPr>
         <w:tc>
           <w:tcPr>
@@ -13608,7 +13608,7 @@
       </w:tblGrid>
       <w:tr>
         <w:trPr>
-          <w:trHeight w:val="460" w:hRule="exact"/>
+          <w:trHeight w:val="340" w:hRule="exact"/>
         </w:trPr>
         <w:tc>
           <w:tcPr>
@@ -13659,7 +13659,7 @@
       </w:tblGrid>
       <w:tr>
         <w:trPr>
-          <w:trHeight w:val="460" w:hRule="exact"/>
+          <w:trHeight w:val="340" w:hRule="exact"/>
         </w:trPr>
         <w:tc>
           <w:tcPr>
@@ -13710,7 +13710,7 @@
       </w:tblGrid>
       <w:tr>
         <w:trPr>
-          <w:trHeight w:val="460" w:hRule="exact"/>
+          <w:trHeight w:val="340" w:hRule="exact"/>
         </w:trPr>
         <w:tc>
           <w:tcPr>
@@ -13761,7 +13761,7 @@
       </w:tblGrid>
       <w:tr>
         <w:trPr>
-          <w:trHeight w:val="460" w:hRule="exact"/>
+          <w:trHeight w:val="340" w:hRule="exact"/>
         </w:trPr>
         <w:tc>
           <w:tcPr>
@@ -13812,7 +13812,7 @@
       </w:tblGrid>
       <w:tr>
         <w:trPr>
-          <w:trHeight w:val="460" w:hRule="exact"/>
+          <w:trHeight w:val="340" w:hRule="exact"/>
         </w:trPr>
         <w:tc>
           <w:tcPr>
@@ -13863,7 +13863,7 @@
       </w:tblGrid>
       <w:tr>
         <w:trPr>
-          <w:trHeight w:val="460" w:hRule="exact"/>
+          <w:trHeight w:val="340" w:hRule="exact"/>
         </w:trPr>
         <w:tc>
           <w:tcPr>
@@ -13914,7 +13914,7 @@
       </w:tblGrid>
       <w:tr>
         <w:trPr>
-          <w:trHeight w:val="460" w:hRule="exact"/>
+          <w:trHeight w:val="340" w:hRule="exact"/>
         </w:trPr>
         <w:tc>
           <w:tcPr>
@@ -14087,7 +14087,7 @@
       </w:tblGrid>
       <w:tr>
         <w:trPr>
-          <w:trHeight w:val="460" w:hRule="exact"/>
+          <w:trHeight w:val="340" w:hRule="exact"/>
         </w:trPr>
         <w:tc>
           <w:tcPr>
@@ -14138,7 +14138,7 @@
       </w:tblGrid>
       <w:tr>
         <w:trPr>
-          <w:trHeight w:val="460" w:hRule="exact"/>
+          <w:trHeight w:val="340" w:hRule="exact"/>
         </w:trPr>
         <w:tc>
           <w:tcPr>
@@ -14189,7 +14189,7 @@
       </w:tblGrid>
       <w:tr>
         <w:trPr>
-          <w:trHeight w:val="460" w:hRule="exact"/>
+          <w:trHeight w:val="340" w:hRule="exact"/>
         </w:trPr>
         <w:tc>
           <w:tcPr>
@@ -14240,7 +14240,7 @@
       </w:tblGrid>
       <w:tr>
         <w:trPr>
-          <w:trHeight w:val="460" w:hRule="exact"/>
+          <w:trHeight w:val="340" w:hRule="exact"/>
         </w:trPr>
         <w:tc>
           <w:tcPr>
@@ -14291,7 +14291,7 @@
       </w:tblGrid>
       <w:tr>
         <w:trPr>
-          <w:trHeight w:val="460" w:hRule="exact"/>
+          <w:trHeight w:val="340" w:hRule="exact"/>
         </w:trPr>
         <w:tc>
           <w:tcPr>
@@ -14380,7 +14380,7 @@
       </w:tblGrid>
       <w:tr>
         <w:trPr>
-          <w:trHeight w:val="460" w:hRule="exact"/>
+          <w:trHeight w:val="340" w:hRule="exact"/>
         </w:trPr>
         <w:tc>
           <w:tcPr>
@@ -14431,7 +14431,7 @@
       </w:tblGrid>
       <w:tr>
         <w:trPr>
-          <w:trHeight w:val="460" w:hRule="exact"/>
+          <w:trHeight w:val="340" w:hRule="exact"/>
         </w:trPr>
         <w:tc>
           <w:tcPr>
@@ -14482,7 +14482,7 @@
       </w:tblGrid>
       <w:tr>
         <w:trPr>
-          <w:trHeight w:val="460" w:hRule="exact"/>
+          <w:trHeight w:val="340" w:hRule="exact"/>
         </w:trPr>
         <w:tc>
           <w:tcPr>
@@ -14579,7 +14579,7 @@
       </w:tblGrid>
       <w:tr>
         <w:trPr>
-          <w:trHeight w:val="460" w:hRule="exact"/>
+          <w:trHeight w:val="340" w:hRule="exact"/>
         </w:trPr>
         <w:tc>
           <w:tcPr>
@@ -14630,7 +14630,7 @@
       </w:tblGrid>
       <w:tr>
         <w:trPr>
-          <w:trHeight w:val="460" w:hRule="exact"/>
+          <w:trHeight w:val="340" w:hRule="exact"/>
         </w:trPr>
         <w:tc>
           <w:tcPr>
@@ -14681,7 +14681,7 @@
       </w:tblGrid>
       <w:tr>
         <w:trPr>
-          <w:trHeight w:val="460" w:hRule="exact"/>
+          <w:trHeight w:val="340" w:hRule="exact"/>
         </w:trPr>
         <w:tc>
           <w:tcPr>
@@ -14732,7 +14732,7 @@
       </w:tblGrid>
       <w:tr>
         <w:trPr>
-          <w:trHeight w:val="460" w:hRule="exact"/>
+          <w:trHeight w:val="340" w:hRule="exact"/>
         </w:trPr>
         <w:tc>
           <w:tcPr>
@@ -14783,7 +14783,7 @@
       </w:tblGrid>
       <w:tr>
         <w:trPr>
-          <w:trHeight w:val="460" w:hRule="exact"/>
+          <w:trHeight w:val="340" w:hRule="exact"/>
         </w:trPr>
         <w:tc>
           <w:tcPr>
@@ -14834,7 +14834,7 @@
       </w:tblGrid>
       <w:tr>
         <w:trPr>
-          <w:trHeight w:val="460" w:hRule="exact"/>
+          <w:trHeight w:val="340" w:hRule="exact"/>
         </w:trPr>
         <w:tc>
           <w:tcPr>
@@ -14885,7 +14885,7 @@
       </w:tblGrid>
       <w:tr>
         <w:trPr>
-          <w:trHeight w:val="460" w:hRule="exact"/>
+          <w:trHeight w:val="340" w:hRule="exact"/>
         </w:trPr>
         <w:tc>
           <w:tcPr>
@@ -14936,7 +14936,7 @@
       </w:tblGrid>
       <w:tr>
         <w:trPr>
-          <w:trHeight w:val="460" w:hRule="exact"/>
+          <w:trHeight w:val="340" w:hRule="exact"/>
         </w:trPr>
         <w:tc>
           <w:tcPr>
@@ -14987,7 +14987,7 @@
       </w:tblGrid>
       <w:tr>
         <w:trPr>
-          <w:trHeight w:val="460" w:hRule="exact"/>
+          <w:trHeight w:val="340" w:hRule="exact"/>
         </w:trPr>
         <w:tc>
           <w:tcPr>
@@ -15515,7 +15515,7 @@
     <w:next w:val="Normal"/>
     <w:qFormat/>
     <w:pPr>
-      <w:spacing w:after="180" w:before="360"/>
+      <w:spacing w:after="80" w:before="180"/>
       <w:outlineLvl w:val="0"/>
     </w:pPr>
     <w:rPr>
@@ -15533,7 +15533,7 @@
     <w:next w:val="Normal"/>
     <w:qFormat/>
     <w:pPr>
-      <w:spacing w:after="120" w:before="280"/>
+      <w:spacing w:after="60" w:before="140"/>
       <w:outlineLvl w:val="1"/>
     </w:pPr>
     <w:rPr>
@@ -15551,7 +15551,7 @@
     <w:next w:val="Normal"/>
     <w:qFormat/>
     <w:pPr>
-      <w:spacing w:after="100" w:before="200"/>
+      <w:spacing w:after="50" w:before="100"/>
       <w:outlineLvl w:val="2"/>
     </w:pPr>
     <w:rPr>

</xml_diff>